<commit_message>
Add Week 38 pre-work story and wire it into the WS2 kit
ws2/prework.html tells one week of the fictional KESTREL project as a
story, with the six room case files at the back; the same story ships
as a PDF for the invitation mail. The kit gains the story in its
pre-work and a 'story in the room' panel, the slides open with a
'Thursday, 07:30' cold open, and the facilitator guide and invitation
messages point to the story.

Co-Authored-By: Claude Opus 5.5 <noreply@anthropic.com>
Claude-Session: https://claude.ai/code/session_01Q2YJhmzjoSxdfw8ZKRnAPH
</commit_message>
<xml_diff>
--- a/ws2/files/WS2_Facilitator_Guide.docx
+++ b/ws2/files/WS2_Facilitator_Guide.docx
@@ -314,7 +314,7 @@
         <w:spacing w:after="60"/>
       </w:pPr>
       <w:r>
-        <w:t xml:space="preserve">You have read your card’s traps (page 4 onward).</w:t>
+        <w:t xml:space="preserve">You have read the pre-work story “Week 38” and your card’s traps (later in this guide).</w:t>
       </w:r>
     </w:p>
     <w:p>
@@ -1785,6 +1785,790 @@
         <w:t xml:space="preserve">Tests all pass: “Did we run the trap? Every pack has at least two.”</w:t>
       </w:r>
     </w:p>
+    <w:p>
+      <w:pPr>
+        <w:pStyle w:val="Heading2"/>
+      </w:pPr>
+      <w:r>
+        <w:t xml:space="preserve">The story in the room</w:t>
+      </w:r>
+    </w:p>
+    <w:p>
+      <w:r>
+        <w:t xml:space="preserve">Participants arrive having read “Week 38”, the KESTREL pre-work story, and their room’s case file. Use the story at three moments.</w:t>
+      </w:r>
+    </w:p>
+    <w:p>
+      <w:pPr>
+        <w:pStyle w:val="ListParagraph"/>
+        <w:numPr>
+          <w:ilvl w:val="0"/>
+          <w:numId w:val="2"/>
+        </w:numPr>
+        <w:spacing w:after="60"/>
+      </w:pPr>
+      <w:r>
+        <w:rPr>
+          <w:b/>
+          <w:bCs/>
+        </w:rPr>
+        <w:t xml:space="preserve">00:00 · Cold open, 45 seconds. </w:t>
+      </w:r>
+      <w:r>
+        <w:t xml:space="preserve">Show the “Thursday, 07:30” slide and read aloud: “It’s Thursday, 07:30. Tape-out in 11 days. A brief for steering at 14:00. A status that may not be green. A customer waiting. Minutes nobody sent. A risk log five weeks old. Ten lessons found too late. Our room takes one of them. In 60 minutes we build the assistant that gives it back.” Then name the room’s chapter.</w:t>
+      </w:r>
+    </w:p>
+    <w:p>
+      <w:pPr>
+        <w:pStyle w:val="ListParagraph"/>
+        <w:numPr>
+          <w:ilvl w:val="0"/>
+          <w:numId w:val="2"/>
+        </w:numPr>
+        <w:spacing w:after="60"/>
+      </w:pPr>
+      <w:r>
+        <w:rPr>
+          <w:b/>
+          <w:bCs/>
+        </w:rPr>
+        <w:t xml:space="preserve">27:00 · The hunt pays off. </w:t>
+      </w:r>
+      <w:r>
+        <w:t xml:space="preserve">Ask who spotted something in the case file that didn’t add up. Those findings become the room’s T2 and T3 tests: does the assistant catch what people caught?</w:t>
+      </w:r>
+    </w:p>
+    <w:p>
+      <w:pPr>
+        <w:pStyle w:val="ListParagraph"/>
+        <w:numPr>
+          <w:ilvl w:val="0"/>
+          <w:numId w:val="2"/>
+        </w:numPr>
+        <w:spacing w:after="60"/>
+      </w:pPr>
+      <w:r>
+        <w:rPr>
+          <w:b/>
+          <w:bCs/>
+        </w:rPr>
+        <w:t xml:space="preserve">Report-out · Close the loop. </w:t>
+      </w:r>
+      <w:r>
+        <w:t xml:space="preserve">Each room opens with one line: “On KESTREL, our Thursday would have started differently, because …”. The host calls rooms in the order of the Thursday list: C4, C1, C6, C2, C3, C5.</w:t>
+      </w:r>
+    </w:p>
+    <w:tbl>
+      <w:tblPr>
+        <w:tblW w:type="dxa" w:w="9638"/>
+        <w:tblBorders>
+          <w:top w:val="single" w:color="auto" w:sz="4"/>
+          <w:left w:val="single" w:color="auto" w:sz="4"/>
+          <w:bottom w:val="single" w:color="auto" w:sz="4"/>
+          <w:right w:val="single" w:color="auto" w:sz="4"/>
+          <w:insideH w:val="single" w:color="auto" w:sz="4"/>
+          <w:insideV w:val="single" w:color="auto" w:sz="4"/>
+        </w:tblBorders>
+      </w:tblPr>
+      <w:tblGrid>
+        <w:gridCol w:w="1500"/>
+        <w:gridCol w:w="3200"/>
+        <w:gridCol w:w="4938"/>
+      </w:tblGrid>
+      <w:tr>
+        <w:trPr>
+          <w:cantSplit/>
+          <w:tblHeader/>
+        </w:trPr>
+        <w:tc>
+          <w:tcPr>
+            <w:tcW w:type="dxa" w:w="1500"/>
+            <w:tcBorders>
+              <w:top w:val="single" w:color="C8D5D1" w:sz="4"/>
+              <w:left w:val="single" w:color="C8D5D1" w:sz="4"/>
+              <w:bottom w:val="single" w:color="C8D5D1" w:sz="4"/>
+              <w:right w:val="single" w:color="C8D5D1" w:sz="4"/>
+            </w:tcBorders>
+            <w:shd w:fill="E5ECEA" w:color="auto" w:val="clear"/>
+            <w:tcMar>
+              <w:top w:type="dxa" w:w="80"/>
+              <w:left w:type="dxa" w:w="110"/>
+              <w:bottom w:type="dxa" w:w="80"/>
+              <w:right w:type="dxa" w:w="110"/>
+            </w:tcMar>
+            <w:vAlign w:val="top"/>
+          </w:tcPr>
+          <w:p>
+            <w:pPr>
+              <w:spacing w:after="0"/>
+            </w:pPr>
+            <w:r>
+              <w:rPr>
+                <w:b/>
+                <w:bCs/>
+                <w:sz w:val="19"/>
+                <w:szCs w:val="19"/>
+              </w:rPr>
+              <w:t xml:space="preserve">Card</w:t>
+            </w:r>
+          </w:p>
+        </w:tc>
+        <w:tc>
+          <w:tcPr>
+            <w:tcW w:type="dxa" w:w="3200"/>
+            <w:tcBorders>
+              <w:top w:val="single" w:color="C8D5D1" w:sz="4"/>
+              <w:left w:val="single" w:color="C8D5D1" w:sz="4"/>
+              <w:bottom w:val="single" w:color="C8D5D1" w:sz="4"/>
+              <w:right w:val="single" w:color="C8D5D1" w:sz="4"/>
+            </w:tcBorders>
+            <w:shd w:fill="E5ECEA" w:color="auto" w:val="clear"/>
+            <w:tcMar>
+              <w:top w:type="dxa" w:w="80"/>
+              <w:left w:type="dxa" w:w="110"/>
+              <w:bottom w:type="dxa" w:w="80"/>
+              <w:right w:type="dxa" w:w="110"/>
+            </w:tcMar>
+            <w:vAlign w:val="top"/>
+          </w:tcPr>
+          <w:p>
+            <w:pPr>
+              <w:spacing w:after="0"/>
+            </w:pPr>
+            <w:r>
+              <w:rPr>
+                <w:b/>
+                <w:bCs/>
+                <w:sz w:val="19"/>
+                <w:szCs w:val="19"/>
+              </w:rPr>
+              <w:t xml:space="preserve">Story chapter</w:t>
+            </w:r>
+          </w:p>
+        </w:tc>
+        <w:tc>
+          <w:tcPr>
+            <w:tcW w:type="dxa" w:w="4938"/>
+            <w:tcBorders>
+              <w:top w:val="single" w:color="C8D5D1" w:sz="4"/>
+              <w:left w:val="single" w:color="C8D5D1" w:sz="4"/>
+              <w:bottom w:val="single" w:color="C8D5D1" w:sz="4"/>
+              <w:right w:val="single" w:color="C8D5D1" w:sz="4"/>
+            </w:tcBorders>
+            <w:shd w:fill="E5ECEA" w:color="auto" w:val="clear"/>
+            <w:tcMar>
+              <w:top w:type="dxa" w:w="80"/>
+              <w:left w:type="dxa" w:w="110"/>
+              <w:bottom w:type="dxa" w:w="80"/>
+              <w:right w:type="dxa" w:w="110"/>
+            </w:tcMar>
+            <w:vAlign w:val="top"/>
+          </w:tcPr>
+          <w:p>
+            <w:pPr>
+              <w:spacing w:after="0"/>
+            </w:pPr>
+            <w:r>
+              <w:rPr>
+                <w:b/>
+                <w:bCs/>
+                <w:sz w:val="19"/>
+                <w:szCs w:val="19"/>
+              </w:rPr>
+              <w:t xml:space="preserve">The moment in the story</w:t>
+            </w:r>
+          </w:p>
+        </w:tc>
+      </w:tr>
+      <w:tr>
+        <w:trPr>
+          <w:cantSplit/>
+          <w:tblHeader w:val="off"/>
+        </w:trPr>
+        <w:tc>
+          <w:tcPr>
+            <w:tcW w:type="dxa" w:w="1500"/>
+            <w:tcBorders>
+              <w:top w:val="single" w:color="C8D5D1" w:sz="4"/>
+              <w:left w:val="single" w:color="C8D5D1" w:sz="4"/>
+              <w:bottom w:val="single" w:color="C8D5D1" w:sz="4"/>
+              <w:right w:val="single" w:color="C8D5D1" w:sz="4"/>
+            </w:tcBorders>
+            <w:tcMar>
+              <w:top w:type="dxa" w:w="80"/>
+              <w:left w:type="dxa" w:w="110"/>
+              <w:bottom w:type="dxa" w:w="80"/>
+              <w:right w:type="dxa" w:w="110"/>
+            </w:tcMar>
+            <w:vAlign w:val="top"/>
+          </w:tcPr>
+          <w:p>
+            <w:pPr>
+              <w:spacing w:after="0"/>
+            </w:pPr>
+            <w:r>
+              <w:rPr>
+                <w:b/>
+                <w:bCs/>
+                <w:sz w:val="19"/>
+                <w:szCs w:val="19"/>
+              </w:rPr>
+              <w:t xml:space="preserve">C6</w:t>
+            </w:r>
+          </w:p>
+        </w:tc>
+        <w:tc>
+          <w:tcPr>
+            <w:tcW w:type="dxa" w:w="3200"/>
+            <w:tcBorders>
+              <w:top w:val="single" w:color="C8D5D1" w:sz="4"/>
+              <w:left w:val="single" w:color="C8D5D1" w:sz="4"/>
+              <w:bottom w:val="single" w:color="C8D5D1" w:sz="4"/>
+              <w:right w:val="single" w:color="C8D5D1" w:sz="4"/>
+            </w:tcBorders>
+            <w:tcMar>
+              <w:top w:type="dxa" w:w="80"/>
+              <w:left w:type="dxa" w:w="110"/>
+              <w:bottom w:type="dxa" w:w="80"/>
+              <w:right w:type="dxa" w:w="110"/>
+            </w:tcMar>
+            <w:vAlign w:val="top"/>
+          </w:tcPr>
+          <w:p>
+            <w:pPr>
+              <w:spacing w:after="0"/>
+            </w:pPr>
+            <w:r>
+              <w:rPr>
+                <w:sz w:val="19"/>
+                <w:szCs w:val="19"/>
+              </w:rPr>
+              <w:t xml:space="preserve">Chapter 1 · Monday 11:04</w:t>
+            </w:r>
+          </w:p>
+        </w:tc>
+        <w:tc>
+          <w:tcPr>
+            <w:tcW w:type="dxa" w:w="4938"/>
+            <w:tcBorders>
+              <w:top w:val="single" w:color="C8D5D1" w:sz="4"/>
+              <w:left w:val="single" w:color="C8D5D1" w:sz="4"/>
+              <w:bottom w:val="single" w:color="C8D5D1" w:sz="4"/>
+              <w:right w:val="single" w:color="C8D5D1" w:sz="4"/>
+            </w:tcBorders>
+            <w:tcMar>
+              <w:top w:type="dxa" w:w="80"/>
+              <w:left w:type="dxa" w:w="110"/>
+              <w:bottom w:type="dxa" w:w="80"/>
+              <w:right w:type="dxa" w:w="110"/>
+            </w:tcMar>
+            <w:vAlign w:val="top"/>
+          </w:tcPr>
+          <w:p>
+            <w:pPr>
+              <w:spacing w:after="0"/>
+            </w:pPr>
+            <w:r>
+              <w:rPr>
+                <w:sz w:val="19"/>
+                <w:szCs w:val="19"/>
+              </w:rPr>
+              <w:t xml:space="preserve">Sofia forwards CR-014: “Can we do this?”</w:t>
+            </w:r>
+          </w:p>
+        </w:tc>
+      </w:tr>
+      <w:tr>
+        <w:trPr>
+          <w:cantSplit/>
+          <w:tblHeader w:val="off"/>
+        </w:trPr>
+        <w:tc>
+          <w:tcPr>
+            <w:tcW w:type="dxa" w:w="1500"/>
+            <w:tcBorders>
+              <w:top w:val="single" w:color="C8D5D1" w:sz="4"/>
+              <w:left w:val="single" w:color="C8D5D1" w:sz="4"/>
+              <w:bottom w:val="single" w:color="C8D5D1" w:sz="4"/>
+              <w:right w:val="single" w:color="C8D5D1" w:sz="4"/>
+            </w:tcBorders>
+            <w:tcMar>
+              <w:top w:type="dxa" w:w="80"/>
+              <w:left w:type="dxa" w:w="110"/>
+              <w:bottom w:type="dxa" w:w="80"/>
+              <w:right w:type="dxa" w:w="110"/>
+            </w:tcMar>
+            <w:vAlign w:val="top"/>
+          </w:tcPr>
+          <w:p>
+            <w:pPr>
+              <w:spacing w:after="0"/>
+            </w:pPr>
+            <w:r>
+              <w:rPr>
+                <w:b/>
+                <w:bCs/>
+                <w:sz w:val="19"/>
+                <w:szCs w:val="19"/>
+              </w:rPr>
+              <w:t xml:space="preserve">C3</w:t>
+            </w:r>
+          </w:p>
+        </w:tc>
+        <w:tc>
+          <w:tcPr>
+            <w:tcW w:type="dxa" w:w="3200"/>
+            <w:tcBorders>
+              <w:top w:val="single" w:color="C8D5D1" w:sz="4"/>
+              <w:left w:val="single" w:color="C8D5D1" w:sz="4"/>
+              <w:bottom w:val="single" w:color="C8D5D1" w:sz="4"/>
+              <w:right w:val="single" w:color="C8D5D1" w:sz="4"/>
+            </w:tcBorders>
+            <w:tcMar>
+              <w:top w:type="dxa" w:w="80"/>
+              <w:left w:type="dxa" w:w="110"/>
+              <w:bottom w:type="dxa" w:w="80"/>
+              <w:right w:type="dxa" w:w="110"/>
+            </w:tcMar>
+            <w:vAlign w:val="top"/>
+          </w:tcPr>
+          <w:p>
+            <w:pPr>
+              <w:spacing w:after="0"/>
+            </w:pPr>
+            <w:r>
+              <w:rPr>
+                <w:sz w:val="19"/>
+                <w:szCs w:val="19"/>
+              </w:rPr>
+              <w:t xml:space="preserve">Chapter 2 · Monday 16:30</w:t>
+            </w:r>
+          </w:p>
+        </w:tc>
+        <w:tc>
+          <w:tcPr>
+            <w:tcW w:type="dxa" w:w="4938"/>
+            <w:tcBorders>
+              <w:top w:val="single" w:color="C8D5D1" w:sz="4"/>
+              <w:left w:val="single" w:color="C8D5D1" w:sz="4"/>
+              <w:bottom w:val="single" w:color="C8D5D1" w:sz="4"/>
+              <w:right w:val="single" w:color="C8D5D1" w:sz="4"/>
+            </w:tcBorders>
+            <w:tcMar>
+              <w:top w:type="dxa" w:w="80"/>
+              <w:left w:type="dxa" w:w="110"/>
+              <w:bottom w:type="dxa" w:w="80"/>
+              <w:right w:type="dxa" w:w="110"/>
+            </w:tcMar>
+            <w:vAlign w:val="top"/>
+          </w:tcPr>
+          <w:p>
+            <w:pPr>
+              <w:spacing w:after="0"/>
+            </w:pPr>
+            <w:r>
+              <w:rPr>
+                <w:sz w:val="19"/>
+                <w:szCs w:val="19"/>
+              </w:rPr>
+              <w:t xml:space="preserve">The RAID log, last updated five weeks ago</w:t>
+            </w:r>
+          </w:p>
+        </w:tc>
+      </w:tr>
+      <w:tr>
+        <w:trPr>
+          <w:cantSplit/>
+          <w:tblHeader w:val="off"/>
+        </w:trPr>
+        <w:tc>
+          <w:tcPr>
+            <w:tcW w:type="dxa" w:w="1500"/>
+            <w:tcBorders>
+              <w:top w:val="single" w:color="C8D5D1" w:sz="4"/>
+              <w:left w:val="single" w:color="C8D5D1" w:sz="4"/>
+              <w:bottom w:val="single" w:color="C8D5D1" w:sz="4"/>
+              <w:right w:val="single" w:color="C8D5D1" w:sz="4"/>
+            </w:tcBorders>
+            <w:tcMar>
+              <w:top w:type="dxa" w:w="80"/>
+              <w:left w:type="dxa" w:w="110"/>
+              <w:bottom w:type="dxa" w:w="80"/>
+              <w:right w:type="dxa" w:w="110"/>
+            </w:tcMar>
+            <w:vAlign w:val="top"/>
+          </w:tcPr>
+          <w:p>
+            <w:pPr>
+              <w:spacing w:after="0"/>
+            </w:pPr>
+            <w:r>
+              <w:rPr>
+                <w:b/>
+                <w:bCs/>
+                <w:sz w:val="19"/>
+                <w:szCs w:val="19"/>
+              </w:rPr>
+              <w:t xml:space="preserve">C2</w:t>
+            </w:r>
+          </w:p>
+        </w:tc>
+        <w:tc>
+          <w:tcPr>
+            <w:tcW w:type="dxa" w:w="3200"/>
+            <w:tcBorders>
+              <w:top w:val="single" w:color="C8D5D1" w:sz="4"/>
+              <w:left w:val="single" w:color="C8D5D1" w:sz="4"/>
+              <w:bottom w:val="single" w:color="C8D5D1" w:sz="4"/>
+              <w:right w:val="single" w:color="C8D5D1" w:sz="4"/>
+            </w:tcBorders>
+            <w:tcMar>
+              <w:top w:type="dxa" w:w="80"/>
+              <w:left w:type="dxa" w:w="110"/>
+              <w:bottom w:type="dxa" w:w="80"/>
+              <w:right w:type="dxa" w:w="110"/>
+            </w:tcMar>
+            <w:vAlign w:val="top"/>
+          </w:tcPr>
+          <w:p>
+            <w:pPr>
+              <w:spacing w:after="0"/>
+            </w:pPr>
+            <w:r>
+              <w:rPr>
+                <w:sz w:val="19"/>
+                <w:szCs w:val="19"/>
+              </w:rPr>
+              <w:t xml:space="preserve">Chapter 3 · Tuesday 10:00</w:t>
+            </w:r>
+          </w:p>
+        </w:tc>
+        <w:tc>
+          <w:tcPr>
+            <w:tcW w:type="dxa" w:w="4938"/>
+            <w:tcBorders>
+              <w:top w:val="single" w:color="C8D5D1" w:sz="4"/>
+              <w:left w:val="single" w:color="C8D5D1" w:sz="4"/>
+              <w:bottom w:val="single" w:color="C8D5D1" w:sz="4"/>
+              <w:right w:val="single" w:color="C8D5D1" w:sz="4"/>
+            </w:tcBorders>
+            <w:tcMar>
+              <w:top w:type="dxa" w:w="80"/>
+              <w:left w:type="dxa" w:w="110"/>
+              <w:bottom w:type="dxa" w:w="80"/>
+              <w:right w:type="dxa" w:w="110"/>
+            </w:tcMar>
+            <w:vAlign w:val="top"/>
+          </w:tcPr>
+          <w:p>
+            <w:pPr>
+              <w:spacing w:after="0"/>
+            </w:pPr>
+            <w:r>
+              <w:rPr>
+                <w:sz w:val="19"/>
+                <w:szCs w:val="19"/>
+              </w:rPr>
+              <w:t xml:space="preserve">The weekly sync nobody wrote up</w:t>
+            </w:r>
+          </w:p>
+        </w:tc>
+      </w:tr>
+      <w:tr>
+        <w:trPr>
+          <w:cantSplit/>
+          <w:tblHeader w:val="off"/>
+        </w:trPr>
+        <w:tc>
+          <w:tcPr>
+            <w:tcW w:type="dxa" w:w="1500"/>
+            <w:tcBorders>
+              <w:top w:val="single" w:color="C8D5D1" w:sz="4"/>
+              <w:left w:val="single" w:color="C8D5D1" w:sz="4"/>
+              <w:bottom w:val="single" w:color="C8D5D1" w:sz="4"/>
+              <w:right w:val="single" w:color="C8D5D1" w:sz="4"/>
+            </w:tcBorders>
+            <w:tcMar>
+              <w:top w:type="dxa" w:w="80"/>
+              <w:left w:type="dxa" w:w="110"/>
+              <w:bottom w:type="dxa" w:w="80"/>
+              <w:right w:type="dxa" w:w="110"/>
+            </w:tcMar>
+            <w:vAlign w:val="top"/>
+          </w:tcPr>
+          <w:p>
+            <w:pPr>
+              <w:spacing w:after="0"/>
+            </w:pPr>
+            <w:r>
+              <w:rPr>
+                <w:b/>
+                <w:bCs/>
+                <w:sz w:val="19"/>
+                <w:szCs w:val="19"/>
+              </w:rPr>
+              <w:t xml:space="preserve">C1</w:t>
+            </w:r>
+          </w:p>
+        </w:tc>
+        <w:tc>
+          <w:tcPr>
+            <w:tcW w:type="dxa" w:w="3200"/>
+            <w:tcBorders>
+              <w:top w:val="single" w:color="C8D5D1" w:sz="4"/>
+              <w:left w:val="single" w:color="C8D5D1" w:sz="4"/>
+              <w:bottom w:val="single" w:color="C8D5D1" w:sz="4"/>
+              <w:right w:val="single" w:color="C8D5D1" w:sz="4"/>
+            </w:tcBorders>
+            <w:tcMar>
+              <w:top w:type="dxa" w:w="80"/>
+              <w:left w:type="dxa" w:w="110"/>
+              <w:bottom w:type="dxa" w:w="80"/>
+              <w:right w:type="dxa" w:w="110"/>
+            </w:tcMar>
+            <w:vAlign w:val="top"/>
+          </w:tcPr>
+          <w:p>
+            <w:pPr>
+              <w:spacing w:after="0"/>
+            </w:pPr>
+            <w:r>
+              <w:rPr>
+                <w:sz w:val="19"/>
+                <w:szCs w:val="19"/>
+              </w:rPr>
+              <w:t xml:space="preserve">Chapter 4 · Wednesday 15:45</w:t>
+            </w:r>
+          </w:p>
+        </w:tc>
+        <w:tc>
+          <w:tcPr>
+            <w:tcW w:type="dxa" w:w="4938"/>
+            <w:tcBorders>
+              <w:top w:val="single" w:color="C8D5D1" w:sz="4"/>
+              <w:left w:val="single" w:color="C8D5D1" w:sz="4"/>
+              <w:bottom w:val="single" w:color="C8D5D1" w:sz="4"/>
+              <w:right w:val="single" w:color="C8D5D1" w:sz="4"/>
+            </w:tcBorders>
+            <w:tcMar>
+              <w:top w:type="dxa" w:w="80"/>
+              <w:left w:type="dxa" w:w="110"/>
+              <w:bottom w:type="dxa" w:w="80"/>
+              <w:right w:type="dxa" w:w="110"/>
+            </w:tcMar>
+            <w:vAlign w:val="top"/>
+          </w:tcPr>
+          <w:p>
+            <w:pPr>
+              <w:spacing w:after="0"/>
+            </w:pPr>
+            <w:r>
+              <w:rPr>
+                <w:sz w:val="19"/>
+                <w:szCs w:val="19"/>
+              </w:rPr>
+              <w:t xml:space="preserve">Is KESTREL still green?</w:t>
+            </w:r>
+          </w:p>
+        </w:tc>
+      </w:tr>
+      <w:tr>
+        <w:trPr>
+          <w:cantSplit/>
+          <w:tblHeader w:val="off"/>
+        </w:trPr>
+        <w:tc>
+          <w:tcPr>
+            <w:tcW w:type="dxa" w:w="1500"/>
+            <w:tcBorders>
+              <w:top w:val="single" w:color="C8D5D1" w:sz="4"/>
+              <w:left w:val="single" w:color="C8D5D1" w:sz="4"/>
+              <w:bottom w:val="single" w:color="C8D5D1" w:sz="4"/>
+              <w:right w:val="single" w:color="C8D5D1" w:sz="4"/>
+            </w:tcBorders>
+            <w:tcMar>
+              <w:top w:type="dxa" w:w="80"/>
+              <w:left w:type="dxa" w:w="110"/>
+              <w:bottom w:type="dxa" w:w="80"/>
+              <w:right w:type="dxa" w:w="110"/>
+            </w:tcMar>
+            <w:vAlign w:val="top"/>
+          </w:tcPr>
+          <w:p>
+            <w:pPr>
+              <w:spacing w:after="0"/>
+            </w:pPr>
+            <w:r>
+              <w:rPr>
+                <w:b/>
+                <w:bCs/>
+                <w:sz w:val="19"/>
+                <w:szCs w:val="19"/>
+              </w:rPr>
+              <w:t xml:space="preserve">C4</w:t>
+            </w:r>
+          </w:p>
+        </w:tc>
+        <w:tc>
+          <w:tcPr>
+            <w:tcW w:type="dxa" w:w="3200"/>
+            <w:tcBorders>
+              <w:top w:val="single" w:color="C8D5D1" w:sz="4"/>
+              <w:left w:val="single" w:color="C8D5D1" w:sz="4"/>
+              <w:bottom w:val="single" w:color="C8D5D1" w:sz="4"/>
+              <w:right w:val="single" w:color="C8D5D1" w:sz="4"/>
+            </w:tcBorders>
+            <w:tcMar>
+              <w:top w:type="dxa" w:w="80"/>
+              <w:left w:type="dxa" w:w="110"/>
+              <w:bottom w:type="dxa" w:w="80"/>
+              <w:right w:type="dxa" w:w="110"/>
+            </w:tcMar>
+            <w:vAlign w:val="top"/>
+          </w:tcPr>
+          <w:p>
+            <w:pPr>
+              <w:spacing w:after="0"/>
+            </w:pPr>
+            <w:r>
+              <w:rPr>
+                <w:sz w:val="19"/>
+                <w:szCs w:val="19"/>
+              </w:rPr>
+              <w:t xml:space="preserve">Chapter 5 · Wednesday 21:37</w:t>
+            </w:r>
+          </w:p>
+        </w:tc>
+        <w:tc>
+          <w:tcPr>
+            <w:tcW w:type="dxa" w:w="4938"/>
+            <w:tcBorders>
+              <w:top w:val="single" w:color="C8D5D1" w:sz="4"/>
+              <w:left w:val="single" w:color="C8D5D1" w:sz="4"/>
+              <w:bottom w:val="single" w:color="C8D5D1" w:sz="4"/>
+              <w:right w:val="single" w:color="C8D5D1" w:sz="4"/>
+            </w:tcBorders>
+            <w:tcMar>
+              <w:top w:type="dxa" w:w="80"/>
+              <w:left w:type="dxa" w:w="110"/>
+              <w:bottom w:type="dxa" w:w="80"/>
+              <w:right w:type="dxa" w:w="110"/>
+            </w:tcMar>
+            <w:vAlign w:val="top"/>
+          </w:tcPr>
+          <w:p>
+            <w:pPr>
+              <w:spacing w:after="0"/>
+            </w:pPr>
+            <w:r>
+              <w:rPr>
+                <w:sz w:val="19"/>
+                <w:szCs w:val="19"/>
+              </w:rPr>
+              <w:t xml:space="preserve">Five opinions for a one-page brief</w:t>
+            </w:r>
+          </w:p>
+        </w:tc>
+      </w:tr>
+      <w:tr>
+        <w:trPr>
+          <w:cantSplit/>
+          <w:tblHeader w:val="off"/>
+        </w:trPr>
+        <w:tc>
+          <w:tcPr>
+            <w:tcW w:type="dxa" w:w="1500"/>
+            <w:tcBorders>
+              <w:top w:val="single" w:color="C8D5D1" w:sz="4"/>
+              <w:left w:val="single" w:color="C8D5D1" w:sz="4"/>
+              <w:bottom w:val="single" w:color="C8D5D1" w:sz="4"/>
+              <w:right w:val="single" w:color="C8D5D1" w:sz="4"/>
+            </w:tcBorders>
+            <w:tcMar>
+              <w:top w:type="dxa" w:w="80"/>
+              <w:left w:type="dxa" w:w="110"/>
+              <w:bottom w:type="dxa" w:w="80"/>
+              <w:right w:type="dxa" w:w="110"/>
+            </w:tcMar>
+            <w:vAlign w:val="top"/>
+          </w:tcPr>
+          <w:p>
+            <w:pPr>
+              <w:spacing w:after="0"/>
+            </w:pPr>
+            <w:r>
+              <w:rPr>
+                <w:b/>
+                <w:bCs/>
+                <w:sz w:val="19"/>
+                <w:szCs w:val="19"/>
+              </w:rPr>
+              <w:t xml:space="preserve">C5</w:t>
+            </w:r>
+          </w:p>
+        </w:tc>
+        <w:tc>
+          <w:tcPr>
+            <w:tcW w:type="dxa" w:w="3200"/>
+            <w:tcBorders>
+              <w:top w:val="single" w:color="C8D5D1" w:sz="4"/>
+              <w:left w:val="single" w:color="C8D5D1" w:sz="4"/>
+              <w:bottom w:val="single" w:color="C8D5D1" w:sz="4"/>
+              <w:right w:val="single" w:color="C8D5D1" w:sz="4"/>
+            </w:tcBorders>
+            <w:tcMar>
+              <w:top w:type="dxa" w:w="80"/>
+              <w:left w:type="dxa" w:w="110"/>
+              <w:bottom w:type="dxa" w:w="80"/>
+              <w:right w:type="dxa" w:w="110"/>
+            </w:tcMar>
+            <w:vAlign w:val="top"/>
+          </w:tcPr>
+          <w:p>
+            <w:pPr>
+              <w:spacing w:after="0"/>
+            </w:pPr>
+            <w:r>
+              <w:rPr>
+                <w:sz w:val="19"/>
+                <w:szCs w:val="19"/>
+              </w:rPr>
+              <w:t xml:space="preserve">Chapter 6 · Thursday 06:50</w:t>
+            </w:r>
+          </w:p>
+        </w:tc>
+        <w:tc>
+          <w:tcPr>
+            <w:tcW w:type="dxa" w:w="4938"/>
+            <w:tcBorders>
+              <w:top w:val="single" w:color="C8D5D1" w:sz="4"/>
+              <w:left w:val="single" w:color="C8D5D1" w:sz="4"/>
+              <w:bottom w:val="single" w:color="C8D5D1" w:sz="4"/>
+              <w:right w:val="single" w:color="C8D5D1" w:sz="4"/>
+            </w:tcBorders>
+            <w:tcMar>
+              <w:top w:type="dxa" w:w="80"/>
+              <w:left w:type="dxa" w:w="110"/>
+              <w:bottom w:type="dxa" w:w="80"/>
+              <w:right w:type="dxa" w:w="110"/>
+            </w:tcMar>
+            <w:vAlign w:val="top"/>
+          </w:tcPr>
+          <w:p>
+            <w:pPr>
+              <w:spacing w:after="0"/>
+            </w:pPr>
+            <w:r>
+              <w:rPr>
+                <w:sz w:val="19"/>
+                <w:szCs w:val="19"/>
+              </w:rPr>
+              <w:t xml:space="preserve">The lessons file nobody reads</w:t>
+            </w:r>
+          </w:p>
+        </w:tc>
+      </w:tr>
+    </w:tbl>
     <w:p>
       <w:r>
         <w:br w:type="page"/>

</xml_diff>

<commit_message>
Rename the pre-work story to Fourteen Days and add the cinematic briefing
The story, kit, slides and handouts now call the pre-work story
'Fourteen Days' and no longer label it as fictional. The narrated
briefing is replaced by a cinematic version: NXP-style palette,
illustrated KESTREL team, 'agent' wording and 'project manager' spoken
in full. Caption file and narration script are updated to match; the
Week 38 trailer and briefing are removed.

Co-Authored-By: Claude Opus 5.5 <noreply@anthropic.com>
Claude-Session: https://claude.ai/code/session_01Q2YJhmzjoSxdfw8ZKRnAPH
</commit_message>
<xml_diff>
--- a/ws2/files/WS2_Facilitator_Guide.docx
+++ b/ws2/files/WS2_Facilitator_Guide.docx
@@ -314,7 +314,7 @@
         <w:spacing w:after="60"/>
       </w:pPr>
       <w:r>
-        <w:t xml:space="preserve">You have read the pre-work story “Week 38” and your card’s traps (later in this guide).</w:t>
+        <w:t xml:space="preserve">You have read the pre-work story “Fourteen Days” and your card’s traps (later in this guide).</w:t>
       </w:r>
     </w:p>
     <w:p>
@@ -1795,7 +1795,7 @@
     </w:p>
     <w:p>
       <w:r>
-        <w:t xml:space="preserve">Participants arrive having read “Week 38”, the KESTREL pre-work story, and their room’s case file. Use the story at three moments.</w:t>
+        <w:t xml:space="preserve">Participants arrive having read “Fourteen Days”, the KESTREL pre-work story, and their room’s case file. Use the story at three moments.</w:t>
       </w:r>
     </w:p>
     <w:p>
@@ -1815,7 +1815,7 @@
         <w:t xml:space="preserve">00:00 · Cold open, 45 seconds. </w:t>
       </w:r>
       <w:r>
-        <w:t xml:space="preserve">Show the “Thursday, 07:30” slide and read aloud: “It’s Thursday, 07:30. Tape-out in 11 days. A brief for steering at 14:00. A status that may not be green. A customer waiting. Minutes nobody sent. A risk log five weeks old. Ten lessons found too late. Our room takes one of them. In 60 minutes we build the assistant that gives it back.” Then name the room’s chapter.</w:t>
+        <w:t xml:space="preserve">Show the “Thursday, 07:30” slide and read aloud: “It’s Thursday, 07:30. Tape-out in 11 days. A brief for steering at 14:00. A status that may not be green. A customer waiting. Minutes nobody sent. A risk log five weeks old. Ten lessons found too late. Our room takes one of them. In 60 minutes we build the agent that gives it back.” Then name the room’s chapter.</w:t>
       </w:r>
     </w:p>
     <w:p>

</xml_diff>

<commit_message>
Redesign the breakout around giving PMs time back
Rooms now map where the hours go, build an agent for the biggest
repetitive chunk and prove the hours it returns. Pre-work asks
participants to time their own week and plan the hours back instead
of hunting for traps; tests become Does the job / Time test / Trust
check, with the traps kept as the trust check. Story, film, kit,
readouts, slides, Pilot Pack, facilitator guide, messages and
scorecard follow the new framing. Earlier versions stay available
under ws2/archive and are linked from the kit.

Co-Authored-By: Claude Opus 5.5 <noreply@anthropic.com>
Claude-Session: https://claude.ai/code/session_01Q2YJhmzjoSxdfw8ZKRnAPH
</commit_message>
<xml_diff>
--- a/ws2/files/WS2_Facilitator_Guide.docx
+++ b/ws2/files/WS2_Facilitator_Guide.docx
@@ -963,7 +963,7 @@
         <w:pStyle w:val="Heading3"/>
       </w:pPr>
       <w:r>
-        <w:t xml:space="preserve">05:00–15:00   Frame the pain</w:t>
+        <w:t xml:space="preserve">05:00–15:00   Map the hours</w:t>
       </w:r>
     </w:p>
     <w:p>
@@ -980,7 +980,7 @@
           <w:i/>
           <w:iCs/>
         </w:rPr>
-        <w:t xml:space="preserve">“Twenty seconds each: when did this pain last hit you, and what did it cost you?”</w:t>
+        <w:t xml:space="preserve">“Twenty seconds each: how many hours does this job take you in a normal week?”</w:t>
       </w:r>
     </w:p>
     <w:p>
@@ -1007,46 +1007,59 @@
         <w:spacing w:after="60"/>
       </w:pPr>
       <w:r>
-        <w:t xml:space="preserve">Who exactly feels it?</w:t>
-      </w:r>
-    </w:p>
-    <w:p>
-      <w:pPr>
-        <w:pStyle w:val="ListParagraph"/>
-        <w:numPr>
-          <w:ilvl w:val="0"/>
-          <w:numId w:val="2"/>
-        </w:numPr>
-        <w:spacing w:after="60"/>
-      </w:pPr>
-      <w:r>
-        <w:t xml:space="preserve">What happens today, step by step? Which step eats the most time or causes the most errors?</w:t>
-      </w:r>
-    </w:p>
-    <w:p>
-      <w:pPr>
-        <w:pStyle w:val="ListParagraph"/>
-        <w:numPr>
-          <w:ilvl w:val="0"/>
-          <w:numId w:val="2"/>
-        </w:numPr>
-        <w:spacing w:after="60"/>
-      </w:pPr>
-      <w:r>
-        <w:t xml:space="preserve">What number shows the pain today?</w:t>
-      </w:r>
-    </w:p>
-    <w:p>
-      <w:pPr>
-        <w:pStyle w:val="ListParagraph"/>
-        <w:numPr>
-          <w:ilvl w:val="0"/>
-          <w:numId w:val="2"/>
-        </w:numPr>
-        <w:spacing w:after="60"/>
-      </w:pPr>
-      <w:r>
-        <w:t xml:space="preserve">Where is the source of truth?</w:t>
+        <w:t xml:space="preserve">What are the steps of this job, start to finish?</w:t>
+      </w:r>
+    </w:p>
+    <w:p>
+      <w:pPr>
+        <w:pStyle w:val="ListParagraph"/>
+        <w:numPr>
+          <w:ilvl w:val="0"/>
+          <w:numId w:val="2"/>
+        </w:numPr>
+        <w:spacing w:after="60"/>
+      </w:pPr>
+      <w:r>
+        <w:t xml:space="preserve">How many minutes does each step take?</w:t>
+      </w:r>
+    </w:p>
+    <w:p>
+      <w:pPr>
+        <w:pStyle w:val="ListParagraph"/>
+        <w:numPr>
+          <w:ilvl w:val="0"/>
+          <w:numId w:val="2"/>
+        </w:numPr>
+        <w:spacing w:after="60"/>
+      </w:pPr>
+      <w:r>
+        <w:t xml:space="preserve">Which steps are repetitive, and which need the PM’s judgment?</w:t>
+      </w:r>
+    </w:p>
+    <w:p>
+      <w:pPr>
+        <w:pStyle w:val="ListParagraph"/>
+        <w:numPr>
+          <w:ilvl w:val="0"/>
+          <w:numId w:val="2"/>
+        </w:numPr>
+        <w:spacing w:after="60"/>
+      </w:pPr>
+      <w:r>
+        <w:t xml:space="preserve">Which repetitive chunk is the biggest?</w:t>
+      </w:r>
+    </w:p>
+    <w:p>
+      <w:pPr>
+        <w:pStyle w:val="ListParagraph"/>
+        <w:numPr>
+          <w:ilvl w:val="0"/>
+          <w:numId w:val="2"/>
+        </w:numPr>
+        <w:spacing w:after="60"/>
+      </w:pPr>
+      <w:r>
+        <w:t xml:space="preserve">What would the PM do with that time instead?</w:t>
       </w:r>
     </w:p>
     <w:p>
@@ -1073,7 +1086,7 @@
         <w:spacing w:after="60"/>
       </w:pPr>
       <w:r>
-        <w:t xml:space="preserve">The slice: one user, one moment, one output.</w:t>
+        <w:t xml:space="preserve">The chunk the agent takes, and the baseline: hours per PM per week today.</w:t>
       </w:r>
     </w:p>
     <w:p>
@@ -1113,7 +1126,7 @@
           <w:bCs/>
           <w:color w:val="8A5409"/>
         </w:rPr>
-        <w:t xml:space="preserve">◆ Checkpoint 15:00 · One-sentence problem and a baseline in Pilot Pack sections 1–2</w:t>
+        <w:t xml:space="preserve">◆ Checkpoint 15:00 · Task map with minutes per step, the chunk chosen, the baseline in hours</w:t>
       </w:r>
     </w:p>
     <w:p>
@@ -1165,7 +1178,20 @@
         <w:spacing w:after="60"/>
       </w:pPr>
       <w:r>
-        <w:t xml:space="preserve">What goes in, and what comes out for whom?</w:t>
+        <w:t xml:space="preserve">What goes in, and what does the PM receive?</w:t>
+      </w:r>
+    </w:p>
+    <w:p>
+      <w:pPr>
+        <w:pStyle w:val="ListParagraph"/>
+        <w:numPr>
+          <w:ilvl w:val="0"/>
+          <w:numId w:val="2"/>
+        </w:numPr>
+        <w:spacing w:after="60"/>
+      </w:pPr>
+      <w:r>
+        <w:t xml:space="preserve">How long should the PM’s review take?</w:t>
       </w:r>
     </w:p>
     <w:p>
@@ -1440,7 +1466,7 @@
           <w:bCs/>
           <w:color w:val="8A5409"/>
         </w:rPr>
-        <w:t xml:space="preserve">◆ Checkpoint 42:00 · Test results recorded, top three risks listed</w:t>
+        <w:t xml:space="preserve">◆ Checkpoint 42:00 · Test results recorded, review time measured, top three risks listed</w:t>
       </w:r>
     </w:p>
     <w:p>
@@ -1531,7 +1557,7 @@
           <w:bCs/>
           <w:color w:val="8A5409"/>
         </w:rPr>
-        <w:t xml:space="preserve">◆ Checkpoint 50:00 · Final instructions, one guardrail, one metric, level decided</w:t>
+        <w:t xml:space="preserve">◆ Checkpoint 50:00 · Final instructions, one guardrail, hours back per week, level decided</w:t>
       </w:r>
     </w:p>
     <w:p>
@@ -1782,7 +1808,7 @@
         <w:spacing w:after="60"/>
       </w:pPr>
       <w:r>
-        <w:t xml:space="preserve">Tests all pass: “Did we run the trap? Every pack has at least two.”</w:t>
+        <w:t xml:space="preserve">Time test disappoints: “If checking the output takes as long as doing the job, what should the agent do differently?”</w:t>
       </w:r>
     </w:p>
     <w:p>
@@ -1832,10 +1858,10 @@
           <w:b/>
           <w:bCs/>
         </w:rPr>
-        <w:t xml:space="preserve">27:00 · The hunt pays off. </w:t>
-      </w:r>
-      <w:r>
-        <w:t xml:space="preserve">Ask who spotted something in the case file that didn’t add up. Those findings become the room’s T2 and T3 tests: does the assistant catch what people caught?</w:t>
+        <w:t xml:space="preserve">27:00 · The time test. </w:t>
+      </w:r>
+      <w:r>
+        <w:t xml:space="preserve">Time how long the PM needs to check the agent’s output and compare it with the baseline from the task map. Anything the room noticed in the case file becomes the T3 trust check: does the agent flag it for the PM?</w:t>
       </w:r>
     </w:p>
     <w:p>
@@ -4838,7 +4864,7 @@
         <w:spacing w:after="60"/>
       </w:pPr>
       <w:r>
-        <w:t xml:space="preserve">We will know it works when [metric moves].</w:t>
+        <w:t xml:space="preserve">Every PM gets [hours] back a week, for [decisions, stakeholders or strategy].</w:t>
       </w:r>
     </w:p>
     <w:p>

</xml_diff>

<commit_message>
Make one Agent Builder per room a stated prerequisite
Replace "no AI experience needed" with the real requirement: every room
needs at least one member with Agent Builder activated in Copilot Premium;
everyone else contributes ideas and experience. Updated in the story
(highlighted in the pre-work), kit, facilitator guide, pre-work messages,
mock-run plan and scorecard, and the roles and levels slides. Also removes
a near-empty page from the story PDF.

Co-Authored-By: Claude Opus 5.5 <noreply@anthropic.com>
Claude-Session: https://claude.ai/code/session_01Q2YJhmzjoSxdfw8ZKRnAPH
</commit_message>
<xml_diff>
--- a/ws2/files/WS2_Facilitator_Guide.docx
+++ b/ws2/files/WS2_Facilitator_Guide.docx
@@ -288,7 +288,7 @@
         <w:spacing w:after="60"/>
       </w:pPr>
       <w:r>
-        <w:t xml:space="preserve">Your Builder is present and has logged in to the approved AI tool. If not, plan for the paper test.</w:t>
+        <w:t xml:space="preserve">Your Builder is present and has Agent Builder activated in Copilot Premium. If the tool fails, plan for the paper test.</w:t>
       </w:r>
     </w:p>
     <w:p>
@@ -715,7 +715,7 @@
                 <w:sz w:val="20"/>
                 <w:szCs w:val="20"/>
               </w:rPr>
-              <w:t xml:space="preserve">Hands on the approved AI tool. Narrates what they type.</w:t>
+              <w:t xml:space="preserve">Has Agent Builder activated in Copilot Premium: a prerequisite, at least one per room. Narrates what they type.</w:t>
             </w:r>
           </w:p>
         </w:tc>
@@ -955,7 +955,7 @@
         <w:spacing w:after="60"/>
       </w:pPr>
       <w:r>
-        <w:t xml:space="preserve">Check the approved tool is open on the Builder’s screen. If not, choose paper mode now.</w:t>
+        <w:t xml:space="preserve">Check Agent Builder is open on the Builder’s screen. If it fails, choose paper mode now.</w:t>
       </w:r>
     </w:p>
     <w:p>
@@ -1374,7 +1374,7 @@
         <w:spacing w:after="60"/>
       </w:pPr>
       <w:r>
-        <w:t xml:space="preserve">Paste the instructions and the sample data into the approved tool. Run T1, T2 and T3. Record pass or fail and keep the output.</w:t>
+        <w:t xml:space="preserve">Create the agent in Agent Builder with the instructions, then test it with the sample data. Run T1, T2 and T3. Record pass or fail and keep the output.</w:t>
       </w:r>
     </w:p>
     <w:p>

</xml_diff>